<commit_message>
feat(poa): add formal Power of Attorney (富宇大境A2獨立分割全權委任授權書.pdf), unify assignee strictly to 廖倫豪 across all dossiers and dajing.html
</commit_message>
<xml_diff>
--- a/附件一_法定獨立分割可行性研究報告書.docx
+++ b/附件一_法定獨立分割可行性研究報告書.docx
@@ -2876,7 +2876,7 @@
           <w:color w:val="1A1D20"/>
           <w:sz w:val="17"/>
         </w:rPr>
-        <w:t>• 召開大境 6 戶客廳會，推選一名專案受託召集人（廖倫豪 先生）。</w:t>
+        <w:t>• 召開大境 6 戶客廳會，推選一名專案受託召集人（廖倫豪）。</w:t>
       </w:r>
     </w:p>
     <w:p>
@@ -3317,7 +3317,7 @@
                 <w:color w:val="1A1D20"/>
                 <w:sz w:val="17"/>
               </w:rPr>
-              <w:t>立連署書人係台中市沙鹿區「富宇大境（A2 區）」全體區分所有權人。緣於本區 6 戶透天別墅面臨龍社路公有計畫道路，人員車輛出入完全獨立；且生活垃圾均自行等候市府垃圾車清運，完全未使用富宇大地社區內部之收費子母車與環保室。為貫徹權責相符與居住自主，依據《公寓大廈管理條例》第 26 條規定，立連署書人一致申請自富宇大地社區管理委員會獨立分割，成立專屬之「富宇大境管理委員會」，並全權委託 廖倫豪 先生 代表本區全體 6 戶辦理提案、協商、資產移交與公所行政報備全般手續。</w:t>
+              <w:t>立連署書人係台中市沙鹿區「富宇大境（A2 區）」全體區分所有權人。緣於本區 6 戶透天別墅面臨龍社路公有計畫道路，人員車輛出入完全獨立；且生活垃圾均自行等候市府垃圾車清運，完全未使用富宇大地社區內部之收費子母車與環保室。為貫徹權責相符與居住自主，依據《公寓大廈管理條例》第 26 條規定，立連署書人一致申請自富宇大地社區管理委員會獨立分割，成立專屬之「富宇大境管理委員會」，並全權委託 廖倫豪 代表本區全體 6 戶辦理提案、協商、資產移交與公所行政報備全般手續。</w:t>
               <w:br/>
               <w:br/>
               <w:t>全體連署人名冊與簽章：</w:t>

</xml_diff>

<commit_message>
format(align): sync all word and pdf assets with right-aligned accounting figures
</commit_message>
<xml_diff>
--- a/附件一_法定獨立分割可行性研究報告書.docx
+++ b/附件一_法定獨立分割可行性研究報告書.docx
@@ -1825,6 +1825,7 @@
           <w:p>
             <w:pPr>
               <w:spacing w:after="0"/>
+              <w:jc w:val="right"/>
             </w:pPr>
             <w:r>
               <w:rPr>
@@ -1930,6 +1931,7 @@
           <w:p>
             <w:pPr>
               <w:spacing w:after="0"/>
+              <w:jc w:val="right"/>
             </w:pPr>
             <w:r>
               <w:rPr>
@@ -2036,6 +2038,7 @@
           <w:p>
             <w:pPr>
               <w:spacing w:after="0"/>
+              <w:jc w:val="right"/>
             </w:pPr>
             <w:r>
               <w:rPr>
@@ -2142,6 +2145,7 @@
           <w:p>
             <w:pPr>
               <w:spacing w:after="0"/>
+              <w:jc w:val="right"/>
             </w:pPr>
             <w:r>
               <w:rPr>
@@ -2247,6 +2251,7 @@
           <w:p>
             <w:pPr>
               <w:spacing w:after="0"/>
+              <w:jc w:val="right"/>
             </w:pPr>
             <w:r>
               <w:rPr>
@@ -2392,6 +2397,7 @@
           <w:p>
             <w:pPr>
               <w:spacing w:after="0"/>
+              <w:jc w:val="right"/>
             </w:pPr>
             <w:r>
               <w:rPr>
@@ -2471,6 +2477,7 @@
           <w:p>
             <w:pPr>
               <w:spacing w:after="0"/>
+              <w:jc w:val="right"/>
             </w:pPr>
             <w:r>
               <w:rPr>
@@ -2548,6 +2555,7 @@
           <w:p>
             <w:pPr>
               <w:spacing w:after="0"/>
+              <w:jc w:val="right"/>
             </w:pPr>
             <w:r>
               <w:rPr>
@@ -2625,6 +2633,7 @@
           <w:p>
             <w:pPr>
               <w:spacing w:after="0"/>
+              <w:jc w:val="right"/>
             </w:pPr>
             <w:r>
               <w:rPr>
@@ -2702,6 +2711,7 @@
           <w:p>
             <w:pPr>
               <w:spacing w:after="0"/>
+              <w:jc w:val="right"/>
             </w:pPr>
             <w:r>
               <w:rPr>
@@ -2780,6 +2790,7 @@
           <w:p>
             <w:pPr>
               <w:spacing w:after="0"/>
+              <w:jc w:val="right"/>
             </w:pPr>
             <w:r>
               <w:rPr>

</xml_diff>